<commit_message>
Replace two Q2 MDPI references with Q1 MDPI (MAKE) references
</commit_message>
<xml_diff>
--- a/paper/Betelly_UCDI_KBS_Manuscript.docx
+++ b/paper/Betelly_UCDI_KBS_Manuscript.docx
@@ -250,7 +250,7 @@
           <w:sz w:val="24"/>
           <w:szCs w:val="24"/>
         </w:rPr>
-        <w:t xml:space="preserve"> contributions improve ensembles and deep architectures for credit risk [14–16], alongside explainable and ensemble frameworks in other Q1 outlets [17–19]. These works mostly optimise accuracy over </w:t>
+        <w:t xml:space="preserve"> contributions improve ensembles and deep architectures for credit risk [14–16], and explainable credit-evaluation frameworks have been proposed [17]. These works mostly optimise accuracy over </w:t>
       </w:r>
       <w:r>
         <w:rPr>
@@ -268,7 +268,7 @@
           <w:sz w:val="24"/>
           <w:szCs w:val="24"/>
         </w:rPr>
-        <w:t xml:space="preserve"> applicants. Classical reject-option theory [20] and its modern learning-to-reject extensions [21, 22] instead let a model abstain, and profit-oriented uncertainty estimation has recently been proposed for credit scoring [23]. What remains under-examined is how the </w:t>
+        <w:t xml:space="preserve"> applicants. Classical reject-option theory [18] and its modern learning-to-reject extensions [19, 20] instead let a model abstain, and profit-oriented uncertainty estimation has recently been proposed for credit scoring [21]. Khalili et al. embed calibration, cross-conformal uncertainty and governance in one credit-scoring architecture [22], and a 36-dataset tabular benchmark finds that the best calibrator depends on the model family [23]. What remains under-examined is how the </w:t>
       </w:r>
       <w:r>
         <w:rPr>
@@ -304,7 +304,7 @@
           <w:sz w:val="24"/>
           <w:szCs w:val="24"/>
         </w:rPr>
-        <w:t xml:space="preserve"> in a business decision pipeline.</w:t>
+        <w:t xml:space="preserve">, that is, the share of errors routed to human review, in a business decision pipeline.</w:t>
       </w:r>
     </w:p>
     <w:p>
@@ -1605,7 +1605,7 @@
           <w:sz w:val="24"/>
           <w:szCs w:val="24"/>
         </w:rPr>
-        <w:t xml:space="preserve">Table 1 reports test-set performance for the nine variants. Gradient boosting gave the highest ROC-AUC (0.7861) and PR-AUC (0.5667), with the random forest close behind (0.7807), and both clearly ahead of logistic regression (0.7262). Calibration effects were model-dependent (Fig. 1). Isotonic regression cut the ECE of logistic regression from 0.0553 to 0.0161 and improved its Brier score, but it </w:t>
+        <w:t xml:space="preserve">Table 1 reports test-set performance for the nine variants. Gradient boosting gave the highest ROC-AUC (0.7861) and PR-AUC (0.5667), with the random forest close behind (0.7807), and both clearly ahead of logistic regression (0.7262). Calibration effects were model-dependent (Fig. 1), consistent with benchmark evidence of a model–calibrator interaction [23]. Isotonic regression cut the ECE of logistic regression from 0.0553 to 0.0161 and improved its Brier score, but it </w:t>
       </w:r>
       <w:r>
         <w:rPr>
@@ -7291,7 +7291,7 @@
           <w:sz w:val="24"/>
           <w:szCs w:val="24"/>
         </w:rPr>
-        <w:t xml:space="preserve"> explanation and review effort should be spent. The divergence between ECE and error capture also warns against treating calibration as a box-ticking step in AI governance: it should be validated per model, and against the decision metric it is meant to serve [9, 23].</w:t>
+        <w:t xml:space="preserve"> explanation and review effort should be spent. The divergence between ECE and error capture also warns against treating calibration as a box-ticking step in AI governance: it should be validated per model, and against the decision metric it is meant to serve [9, 21, 23].</w:t>
       </w:r>
     </w:p>
     <w:p>
@@ -7306,7 +7306,7 @@
           <w:sz w:val="24"/>
           <w:szCs w:val="24"/>
         </w:rPr>
-        <w:t xml:space="preserve">The study has limitations. It uses a single public data set from one market and period; the 0.5 threshold ignores the asymmetric costs of false approvals and false rejections; human reviewers are assumed to resolve deferred cases correctly, so the figures are upper bounds on system accuracy; and fairness of deferral across demographic groups was not assessed. Future work should combine cost-sensitive thresholds with profit-based uncertainty [23], model imperfect reviewers, and test the framework on further enterprise data sets.</w:t>
+        <w:t xml:space="preserve">The study has limitations. It uses a single public data set from one market and period; the 0.5 threshold ignores the asymmetric costs of false approvals and false rejections; human reviewers are assumed to resolve deferred cases correctly, so the figures are upper bounds on system accuracy; and fairness of deferral across demographic groups was not assessed. Future work should combine cost-sensitive thresholds with profit-based uncertainty [21], model imperfect reviewers, and test the framework on further enterprise data sets.</w:t>
       </w:r>
     </w:p>
     <w:p>
@@ -7786,7 +7786,7 @@
           <w:sz w:val="22"/>
           <w:szCs w:val="22"/>
         </w:rPr>
-        <w:t xml:space="preserve">[18]	A. Akinjole, O. Shobayo, J. Popoola, O. Okoyeigbo, B. Ogunleye, Ensemble-based machine learning algorithm for loan default risk prediction, Mathematics 12 (21) (2024) 3423. https://doi.org/10.3390/math12213423</w:t>
+        <w:t xml:space="preserve">[18]	C.K. Chow, On optimum recognition error and reject tradeoff, IEEE Transactions on Information Theory 16 (1) (1970) 41–46. https://doi.org/10.1109/TIT.1970.1054406</w:t>
       </w:r>
     </w:p>
     <w:p>
@@ -7800,7 +7800,7 @@
           <w:sz w:val="22"/>
           <w:szCs w:val="22"/>
         </w:rPr>
-        <w:t xml:space="preserve">[19]	M.L. Ding, Y.L. Ma, F.Q. You, Domain-constrained stacking framework for credit default prediction, Mathematics 13 (21) (2025) 3451. https://doi.org/10.3390/math13213451</w:t>
+        <w:t xml:space="preserve">[19]	X.-Y. Zhang, G.-S. Xie, X. Li, T. Mei, C.-L. Liu, A survey on learning to reject, Proceedings of the IEEE 111 (2) (2023) 185–215. https://doi.org/10.1109/JPROC.2023.3238024</w:t>
       </w:r>
     </w:p>
     <w:p>
@@ -7814,7 +7814,7 @@
           <w:sz w:val="22"/>
           <w:szCs w:val="22"/>
         </w:rPr>
-        <w:t xml:space="preserve">[20]	C.K. Chow, On optimum recognition error and reject tradeoff, IEEE Transactions on Information Theory 16 (1) (1970) 41–46. https://doi.org/10.1109/TIT.1970.1054406</w:t>
+        <w:t xml:space="preserve">[20]	B. Hanczar, Performance visualization spaces for classification with rejection option, Pattern Recognition 96 (2019) 106984. https://doi.org/10.1016/j.patcog.2019.106984</w:t>
       </w:r>
     </w:p>
     <w:p>
@@ -7828,7 +7828,7 @@
           <w:sz w:val="22"/>
           <w:szCs w:val="22"/>
         </w:rPr>
-        <w:t xml:space="preserve">[21]	X.-Y. Zhang, G.-S. Xie, X. Li, T. Mei, C.-L. Liu, A survey on learning to reject, Proceedings of the IEEE 111 (2) (2023) 185–215. https://doi.org/10.1109/JPROC.2023.3238024</w:t>
+        <w:t xml:space="preserve">[21]	Y. Xu, G. Kou, D. Ergu, Profit-based uncertainty estimation with application to credit scoring, European Journal of Operational Research 325 (2) (2025) 303–316. https://doi.org/10.1016/j.ejor.2025.03.007</w:t>
       </w:r>
     </w:p>
     <w:p>
@@ -7842,7 +7842,7 @@
           <w:sz w:val="22"/>
           <w:szCs w:val="22"/>
         </w:rPr>
-        <w:t xml:space="preserve">[22]	B. Hanczar, Performance visualization spaces for classification with rejection option, Pattern Recognition 96 (2019) 106984. https://doi.org/10.1016/j.patcog.2019.106984</w:t>
+        <w:t xml:space="preserve">[22]	N. Khalili, A. Saleh Sedghpour, M. Jahanbakht, Z. Hosseini, From credit scoring to governed decision systems: Integrating predictive performance, uncertainty, and governance, Machine Learning and Knowledge Extraction 8 (10) (2026) 308. https://doi.org/10.3390/make8100308</w:t>
       </w:r>
     </w:p>
     <w:p>
@@ -7856,7 +7856,7 @@
           <w:sz w:val="22"/>
           <w:szCs w:val="22"/>
         </w:rPr>
-        <w:t xml:space="preserve">[23]	Y. Xu, G. Kou, D. Ergu, Profit-based uncertainty estimation with application to credit scoring, European Journal of Operational Research 325 (2) (2025) 303–316. https://doi.org/10.1016/j.ejor.2025.03.007</w:t>
+        <w:t xml:space="preserve">[23]	D. Šabanović, T. Krčmar, Z. Krpić, I. Lukić, Calibration, architecture, and distribution shift in predictive uncertainty estimation, Machine Learning and Knowledge Extraction 8 (7) (2026) 179. https://doi.org/10.3390/make8070179</w:t>
       </w:r>
     </w:p>
     <w:p>

</xml_diff>